<commit_message>
docs(pitch): rebuild financial model and pitch docs from 2026 cost model
Replace the <GHS 500/month, 2% commission model with one built from
published 2026 prices (Paystack/Hubtel 1.95% collection, GHS 1 payout,
BoG licensing pack, Accra salaries). FX US$1 = GHS 11.60.

- Pricing: 4% all-in (2.5% vendor + 1.5% buyer protection fee); 2%
  loses GHS 4-7 per order after collection fees
- Ask: US$387k pre-seed (stages 1-2, 18 months), ~US$916k seed,
  US$1.30M over 36 months, with low/base/high ranges
- Break-even: ~62,000 orders/month against a staffed GHS 637k/month
  cost base, with fee and ticket-size sensitivity
- GO-TO-MARKET.md section 10 rewritten to match
- Vendor docs and pilot agreement moved to 2.5% and ask about buyer
  acceptance of the 1.5% fee
- Regenerated .docx/.pptx from updated generate_docx.py and
  generate_deck.py
</commit_message>
<xml_diff>
--- a/pitch/Croe_Banking_Partner_Brief.docx
+++ b/pitch/Croe_Banking_Partner_Brief.docx
@@ -669,7 +669,7 @@
                 <w:color w:val="334155"/>
                 <w:sz w:val="19"/>
               </w:rPr>
-              <w:t>Interim supervised pilot; strict transaction caps (&lt;100 txn).</w:t>
+              <w:t>Interim supervised pilot; capped volumes (~250 orders/month by month 6).</w:t>
             </w:r>
           </w:p>
         </w:tc>
@@ -1467,7 +1467,7 @@
                 <w:color w:val="334155"/>
                 <w:sz w:val="19"/>
               </w:rPr>
-              <w:t>Supervised Pilot (Day 1–60)</w:t>
+              <w:t>Supervised Pilot (month 6)</w:t>
             </w:r>
           </w:p>
         </w:tc>
@@ -1490,7 +1490,7 @@
                 <w:color w:val="334155"/>
                 <w:sz w:val="19"/>
               </w:rPr>
-              <w:t>100 txns / mo</w:t>
+              <w:t>250 txns / mo</w:t>
             </w:r>
           </w:p>
         </w:tc>
@@ -1513,7 +1513,7 @@
                 <w:color w:val="334155"/>
                 <w:sz w:val="19"/>
               </w:rPr>
-              <w:t>GHS 120,000.00</w:t>
+              <w:t>GHS 200,000.00</w:t>
             </w:r>
           </w:p>
         </w:tc>
@@ -1536,7 +1536,7 @@
                 <w:color w:val="334155"/>
                 <w:sz w:val="19"/>
               </w:rPr>
-              <w:t>GHS 8,000 – 12,000</w:t>
+              <w:t>GHS 13,000 – 20,000</w:t>
             </w:r>
           </w:p>
         </w:tc>
@@ -1560,7 +1560,7 @@
                 <w:color w:val="334155"/>
                 <w:sz w:val="19"/>
               </w:rPr>
-              <w:t>Commercial Scale (Year 1)</w:t>
+              <w:t>Compliant Launch (month 18)</w:t>
             </w:r>
           </w:p>
         </w:tc>
@@ -1582,7 +1582,7 @@
                 <w:color w:val="334155"/>
                 <w:sz w:val="19"/>
               </w:rPr>
-              <w:t>1,000 txns / mo</w:t>
+              <w:t>5,000 txns / mo</w:t>
             </w:r>
           </w:p>
         </w:tc>
@@ -1604,7 +1604,7 @@
                 <w:color w:val="334155"/>
                 <w:sz w:val="19"/>
               </w:rPr>
-              <w:t>GHS 1,200,000.00</w:t>
+              <w:t>GHS 4,000,000.00</w:t>
             </w:r>
           </w:p>
         </w:tc>
@@ -1626,7 +1626,7 @@
                 <w:color w:val="334155"/>
                 <w:sz w:val="19"/>
               </w:rPr>
-              <w:t>GHS 80,000 – 120,000</w:t>
+              <w:t>GHS 267,000 – 400,000</w:t>
             </w:r>
           </w:p>
         </w:tc>
@@ -1651,7 +1651,7 @@
                 <w:color w:val="334155"/>
                 <w:sz w:val="19"/>
               </w:rPr>
-              <w:t>Expansion (Year 2)</w:t>
+              <w:t>Scale (month 36)</w:t>
             </w:r>
           </w:p>
         </w:tc>
@@ -1674,7 +1674,7 @@
                 <w:color w:val="334155"/>
                 <w:sz w:val="19"/>
               </w:rPr>
-              <w:t>5,000 txns / mo</w:t>
+              <w:t>30,000 txns / mo</w:t>
             </w:r>
           </w:p>
         </w:tc>
@@ -1697,7 +1697,7 @@
                 <w:color w:val="334155"/>
                 <w:sz w:val="19"/>
               </w:rPr>
-              <w:t>GHS 6,000,000.00</w:t>
+              <w:t>GHS 24,000,000.00</w:t>
             </w:r>
           </w:p>
         </w:tc>
@@ -1720,7 +1720,7 @@
                 <w:color w:val="334155"/>
                 <w:sz w:val="19"/>
               </w:rPr>
-              <w:t>GHS 400,000 – 600,000</w:t>
+              <w:t>GHS 1.6M – 2.4M</w:t>
             </w:r>
           </w:p>
         </w:tc>

</xml_diff>